<commit_message>
fix(analysts): correct Alex Saravia initials to ES across Phase I tables and standardize Initiator signature typography
</commit_message>
<xml_diff>
--- a/scratch/Tables OOS-262098 Solyn LLC (E75000) - Phase I.docx
+++ b/scratch/Tables OOS-262098 Solyn LLC (E75000) - Phase I.docx
@@ -1009,7 +1009,7 @@
                 <w:sz w:val="14"/>
                 <w:szCs w:val="14"/>
               </w:rPr>
-              <w:t w:space="preserve" xml:space="preserve">AS</w:t>
+              <w:t w:space="preserve" xml:space="preserve">ES</w:t>
             </w:r>
           </w:p>
         </w:tc>
@@ -1397,7 +1397,7 @@
                 <w:sz w:val="14"/>
                 <w:szCs w:val="14"/>
               </w:rPr>
-              <w:t w:space="preserve" xml:space="preserve">AS </w:t>
+              <w:t w:space="preserve" xml:space="preserve">ES </w:t>
             </w:r>
             <w:r>
               <w:rPr>
@@ -1774,7 +1774,7 @@
                 <w:sz w:val="14"/>
                 <w:szCs w:val="14"/>
               </w:rPr>
-              <w:t w:space="preserve" xml:space="preserve">AS </w:t>
+              <w:t w:space="preserve" xml:space="preserve">ES </w:t>
             </w:r>
             <w:r>
               <w:rPr>
@@ -2216,7 +2216,7 @@
                 <w:sz w:val="14"/>
                 <w:szCs w:val="14"/>
               </w:rPr>
-              <w:t w:space="preserve" xml:space="preserve">AS</w:t>
+              <w:t w:space="preserve" xml:space="preserve">ES</w:t>
             </w:r>
           </w:p>
         </w:tc>
@@ -2653,7 +2653,7 @@
                 <w:sz w:val="14"/>
                 <w:szCs w:val="14"/>
               </w:rPr>
-              <w:t w:space="preserve" xml:space="preserve">AS </w:t>
+              <w:t w:space="preserve" xml:space="preserve">ES </w:t>
             </w:r>
             <w:r>
               <w:rPr>
@@ -3047,7 +3047,7 @@
                 <w:sz w:val="14"/>
                 <w:szCs w:val="14"/>
               </w:rPr>
-              <w:t w:space="preserve" xml:space="preserve">AS </w:t>
+              <w:t w:space="preserve" xml:space="preserve">ES </w:t>
             </w:r>
             <w:r>
               <w:rPr>
@@ -3470,7 +3470,7 @@
                 <w:sz w:val="14"/>
                 <w:szCs w:val="14"/>
               </w:rPr>
-              <w:t w:space="preserve" xml:space="preserve">AS</w:t>
+              <w:t w:space="preserve" xml:space="preserve">ES</w:t>
             </w:r>
           </w:p>
         </w:tc>
@@ -3896,7 +3896,7 @@
                 <w:sz w:val="14"/>
                 <w:szCs w:val="14"/>
               </w:rPr>
-              <w:t w:space="preserve" xml:space="preserve">AS </w:t>
+              <w:t w:space="preserve" xml:space="preserve">ES </w:t>
             </w:r>
             <w:r>
               <w:rPr>
@@ -4290,7 +4290,7 @@
                 <w:sz w:val="14"/>
                 <w:szCs w:val="14"/>
               </w:rPr>
-              <w:t w:space="preserve" xml:space="preserve">AS </w:t>
+              <w:t w:space="preserve" xml:space="preserve">ES </w:t>
             </w:r>
             <w:r>
               <w:rPr>

</xml_diff>